<commit_message>
Contratti: template corretti per tutti i tipi + invio/firma con regolamento, privacy e informativa insieme
- modelli/genera_contratti.py: unico generatore dei 4 template corretti
  (indeterminato, determinato, part-time det/ind), stesse correzioni
  dell'indeterminato. Rimosso lo script singolo (niente doppioni).
- Invio (send_contract): allega SEMPRE contratto + informativa 152 + privacy +
  regolamento (quelli generati per il dipendente); segnala quali accessori
  mancano ancora.
- Firma (avvia_firma): unisce contratto + accessori in UN UNICO PDF (PyPDF2) e
  lo manda a marca temporale + eSignature, così la firma per accettazione copre
  tutti i documenti in una sola volta.
- UI: l'invio non chiede più conferma sul regolamento, mostra i documenti
  inviati e gli eventuali accessori mancanti.

Frontend ricostruito (dist).

Co-Authored-By: Claude Opus 4.8 <noreply@anthropic.com>
Claude-Session: https://claude.ai/code/session_01SyXYWAu8mvvsQA5RcTjVeM
</commit_message>
<xml_diff>
--- a/modelli/Contratto_indeterminato_Turismo.docx
+++ b/modelli/Contratto_indeterminato_Turismo.docx
@@ -70,7 +70,7 @@
         <w:spacing w:after="120"/>
       </w:pPr>
       <w:r>
-        <w:t>L'assunzione è subordinata al positivo superamento di un periodo di prova di {{periodo_prova}} giorni di calendario, durante il quale ciascuna delle parti sarà libera di recedere dal contratto senza obbligo di preavviso, nei limiti e termini previsti dal CCNL applicato.</w:t>
+        <w:t>L'assunzione è subordinata al positivo superamento di un periodo di prova di {{periodo_prova}} giorni di calendario, durante il quale ciascuna delle parti sarà libera di recedere senza obbligo di preavviso, nei limiti e termini previsti dal CCNL applicato (per i contratti a termine non oltre il 50% della durata del rapporto).</w:t>
       </w:r>
     </w:p>
     <w:p>
@@ -86,7 +86,7 @@
         <w:spacing w:after="120"/>
       </w:pPr>
       <w:r>
-        <w:t>Il Lavoratore è assegnato ai locali del Datore di lavoro siti in Piazza Carità, 14 — 80134 Napoli. Resta inteso che l'attività lavorativa potrà essere svolta temporaneamente anche in luoghi diversi da quello di assunzione (ad es. catering), come previsto dal CCNL di riferimento.</w:t>
+        <w:t>Il Lavoratore è assegnato ai locali del Datore di lavoro siti in Piazza Carità, 14 — 80134 Napoli. L'attività potrà essere svolta temporaneamente anche in luoghi diversi (ad es. catering), come previsto dal CCNL di riferimento.</w:t>
       </w:r>
     </w:p>
     <w:p>
@@ -94,7 +94,7 @@
         <w:spacing w:after="120"/>
       </w:pPr>
       <w:r>
-        <w:t>L'orario di lavoro è di {{ore_settimanali}} ore settimanali, con riposo settimanale di norma domenicale, secondo il CCNL applicato. L'orario aziendale potrà essere modificato per esigenze organizzative, previa comunicazione al Lavoratore nei termini previsti dal CCNL di riferimento.</w:t>
+        <w:t>L'orario di lavoro è di {{ore_settimanali}} ore settimanali, con riposo settimanale di norma domenicale, secondo il CCNL applicato. L'orario aziendale potrà essere modificato per esigenze organizzative, previa comunicazione al Lavoratore nei termini previsti dal CCNL.</w:t>
       </w:r>
     </w:p>
     <w:p>
@@ -118,7 +118,7 @@
         <w:spacing w:after="120"/>
       </w:pPr>
       <w:r>
-        <w:t>Per quanto concerne il lavoro straordinario, l'azienda inserisce in busta paga le ore extra effettuate e ne rilascia ricevuta a comprova.</w:t>
+        <w:t>Per il lavoro straordinario l'azienda inserisce in busta paga le ore extra effettuate e ne rilascia ricevuta a comprova.</w:t>
       </w:r>
     </w:p>
     <w:p>
@@ -150,7 +150,7 @@
         <w:spacing w:after="120"/>
       </w:pPr>
       <w:r>
-        <w:t>Il Lavoratore dichiara di essere a conoscenza delle norme relative alle infrazioni disciplinari, alle procedure di contestazione e alle sanzioni contenute nel Codice civile, nella l. n. 300/1970 e nel CCNL richiamato al punto 1, del quale dichiara di prendere visione in estratto, unitamente al regolamento aziendale in allegato. Il Lavoratore si impegna ad attenersi al regolamento aziendale e alle disposizioni interne adottate in Azienda.</w:t>
+        <w:t>Il Lavoratore dichiara di conoscere le norme su infrazioni disciplinari, procedure di contestazione e sanzioni contenute nel Codice civile, nella l. n. 300/1970 e nel CCNL richiamato al punto 1, del quale dichiara di prendere visione in estratto unitamente al regolamento aziendale in allegato, impegnandosi a osservarlo.</w:t>
       </w:r>
     </w:p>
     <w:p>
@@ -166,7 +166,7 @@
         <w:spacing w:after="120"/>
       </w:pPr>
       <w:r>
-        <w:t>Il Datore di lavoro dichiara di applicare le norme in materia di sicurezza sul lavoro, in particolare il d.lgs. n. 81/2008 e s.m.i. Il Lavoratore si impegna a uniformarsi alle relative prescrizioni e a segnalare eventuali situazioni anomale.</w:t>
+        <w:t>Il Datore di lavoro applica le norme in materia di sicurezza sul lavoro, in particolare il d.lgs. n. 81/2008 e s.m.i. Il Lavoratore si impegna a uniformarsi alle prescrizioni e a segnalare situazioni anomale.</w:t>
       </w:r>
     </w:p>
     <w:p>
@@ -174,7 +174,7 @@
         <w:rPr>
           <w:b/>
         </w:rPr>
-        <w:t>8. REGISTRAZIONI OBBLIGATORIE</w:t>
+        <w:t>8. REGISTRAZIONI OBBLIGATORIE E PRIVACY</w:t>
       </w:r>
     </w:p>
     <w:p>
@@ -182,7 +182,7 @@
         <w:spacing w:after="120"/>
       </w:pPr>
       <w:r>
-        <w:t>Con l'assunzione il Lavoratore è iscritto nel Libro Unico del Lavoro tenuto ai sensi di legge.</w:t>
+        <w:t>Con l'assunzione il Lavoratore è iscritto nel Libro Unico del Lavoro. I dati personali sono trattati ai sensi del Reg. UE 2016/679 ai soli fini della gestione del rapporto di lavoro, come da informativa privacy allegata.</w:t>
       </w:r>
     </w:p>
     <w:p>
@@ -190,7 +190,7 @@
         <w:rPr>
           <w:b/>
         </w:rPr>
-        <w:t>9. PRIVACY</w:t>
+        <w:t>9. RISERVATEZZA E OBBLIGO DI FEDELTÀ</w:t>
       </w:r>
     </w:p>
     <w:p>
@@ -198,7 +198,7 @@
         <w:spacing w:after="120"/>
       </w:pPr>
       <w:r>
-        <w:t>I dati del Lavoratore e, se del caso, dei suoi familiari, sono trattati ai sensi della normativa vigente ai soli fini della gestione del rapporto di lavoro, inclusi i rapporti con enti previdenziali, assistenziali e con l'amministrazione finanziaria.</w:t>
+        <w:t>Il Lavoratore si impegna alla riservatezza su dati e notizie acquisiti in occasione dell'attività lavorativa e a non trattare affari in concorrenza con il Datore di lavoro ai sensi dell'art. 2105 c.c.</w:t>
       </w:r>
     </w:p>
     <w:p>
@@ -206,7 +206,7 @@
         <w:rPr>
           <w:b/>
         </w:rPr>
-        <w:t>10. RISERVATEZZA E OBBLIGO DI FEDELTÀ</w:t>
+        <w:t>10. PREVIDENZA COMPLEMENTARE E TFR</w:t>
       </w:r>
     </w:p>
     <w:p>
@@ -214,7 +214,7 @@
         <w:spacing w:after="120"/>
       </w:pPr>
       <w:r>
-        <w:t>Il Lavoratore si impegna alla massima riservatezza su dati e notizie di cui venga a conoscenza in occasione dell'attività lavorativa e si obbliga a non trattare affari in concorrenza con il Datore di lavoro ai sensi dell'art. 2105 c.c.</w:t>
+        <w:t>Ai fini della destinazione del TFR si allega l'informativa ex art. 8, comma 8, del d.lgs. n. 252/2005. Il Lavoratore potrà destinare il TFR a un fondo di previdenza complementare (es. Fon.Te.) o lasciarne la maturazione in azienda.</w:t>
       </w:r>
     </w:p>
     <w:p>
@@ -222,7 +222,7 @@
         <w:rPr>
           <w:b/>
         </w:rPr>
-        <w:t>11. PREVIDENZA COMPLEMENTARE E TFR</w:t>
+        <w:t>11. CLAUSOLA FINALE</w:t>
       </w:r>
     </w:p>
     <w:p>
@@ -230,23 +230,7 @@
         <w:spacing w:after="120"/>
       </w:pPr>
       <w:r>
-        <w:t>Ai fini della destinazione del TFR si allega l'informativa ex art. 8, comma 8, del d.lgs. n. 252/2005 con la relativa modulistica. Il Lavoratore potrà destinare il TFR a un fondo di previdenza complementare (es. Fon.Te.) ovvero lasciarne la maturazione in azienda.</w:t>
-      </w:r>
-    </w:p>
-    <w:p>
-      <w:r>
-        <w:rPr>
-          <w:b/>
-        </w:rPr>
-        <w:t>12. CLAUSOLA FINALE</w:t>
-      </w:r>
-    </w:p>
-    <w:p>
-      <w:pPr>
-        <w:spacing w:after="120"/>
-      </w:pPr>
-      <w:r>
-        <w:t>Per quanto qui non espressamente previsto, il rapporto è regolato dal CCNL applicato e richiamato al punto 1 e dalle norme di legge in materia di lavoro e previdenza.</w:t>
+        <w:t>Per quanto qui non previsto, il rapporto è regolato dal CCNL applicato e richiamato al punto 1 e dalle norme di legge in materia di lavoro e previdenza.</w:t>
       </w:r>
     </w:p>
     <w:p/>
@@ -299,7 +283,7 @@
         <w:spacing w:after="120"/>
       </w:pPr>
       <w:r>
-        <w:t>• Informativa sintetica sulle condizioni applicabili al rapporto di lavoro (D.Lgs. 152/1997).</w:t>
+        <w:t>• Informativa sulle condizioni applicabili al rapporto di lavoro (D.Lgs. 152/1997).</w:t>
       </w:r>
     </w:p>
     <w:p>
@@ -307,7 +291,7 @@
         <w:spacing w:after="120"/>
       </w:pPr>
       <w:r>
-        <w:t>• Informativa privacy ai sensi del Reg. UE 2016/679.</w:t>
+        <w:t>• Informativa privacy (Reg. UE 2016/679).</w:t>
       </w:r>
     </w:p>
     <w:p>
@@ -315,7 +299,7 @@
         <w:spacing w:after="120"/>
       </w:pPr>
       <w:r>
-        <w:t>• Copia del regolamento disciplinare aziendale.</w:t>
+        <w:t>• Regolamento interno/disciplinare aziendale.</w:t>
       </w:r>
     </w:p>
     <w:sectPr>

</xml_diff>